<commit_message>
Refine Lab 10 wording for learning rate, activation, and single perceptron accuracy analysis
</commit_message>
<xml_diff>
--- a/coursework/ml/Lab10/Lab10_Manual_Report.docx
+++ b/coursework/ml/Lab10/Lab10_Manual_Report.docx
@@ -315,7 +315,7 @@
     </w:p>
     <w:p>
       <w:r>
-        <w:t>A single-layer perceptron computes a single linear decision boundary w1*x1 + w2*x2 + b = 0. Solving the 4 inequality constraints for XOR leads to a direct mathematical contradiction (w1 + w2 + b &gt; 0 vs w1 + w2 + b &lt; 0). Thus, a single-layer perceptron cannot solve XOR (maximum 75% accuracy). An MLP with a non-linear hidden layer is required.</w:t>
+        <w:t>A single-layer perceptron computes a single linear decision boundary w1*x1 + w2*x2 + b = 0. Solving the 4 inequality constraints for XOR leads to a direct mathematical contradiction (w1 + w2 + b &gt; 0 vs w1 + w2 + b &lt; 0). Thus, a single-layer perceptron cannot solve XOR (theoretical maximum 75.0% accuracy; empirical demonstration 50.0% accuracy when thresholding p=0.5000 with &gt;= 0.5, classifying all samples as 1). An MLP with a non-linear hidden layer is required.</w:t>
       </w:r>
     </w:p>
     <w:p>
@@ -700,9 +700,9 @@
         <w:br/>
         <w:t>2. Hidden Neurons: 1 neuron fails (75%), 2 neurons solve XOR (100%), 4 neurons provide fast robust convergence (100%), 8 neurons converge rapidly (100%).</w:t>
         <w:br/>
-        <w:t>3. Activation Functions: Linear fails (25-75%), Sigmoid converges slowly, ReLU provides piecewise linear separation, Tanh provides smooth zero-centered gradients and optimal convergence.</w:t>
+        <w:t>3. Activation Functions: Linear fails (25-75%), Sigmoid converges slowly, ReLU provides piecewise linear separation, and Tanh showed the most favorable convergence behavior among the tested activations.</w:t>
         <w:br/>
-        <w:t>4. Learning Rate: 0.001 is too slow, 0.08 is optimal (rapid convergence in &lt;150 epochs), 2.0 is unstable.</w:t>
+        <w:t>4. Learning Rate: 0.001 is too slow; 0.08 provided rapid and stable convergence; 0.5 achieved the lowest final loss in this experiment, whereas 2.0 was unstable.</w:t>
       </w:r>
     </w:p>
     <w:p>

</xml_diff>